<commit_message>
Formalize training login documentation
</commit_message>
<xml_diff>
--- a/docs/歲悅會計系統教育訓練手冊_橘色版.docx
+++ b/docs/歲悅會計系統教育訓練手冊_橘色版.docx
@@ -801,7 +801,7 @@
         <w:pStyle w:val="ListNumber"/>
       </w:pPr>
       <w:r>
-        <w:t>使用公司帳號登入；測試階段可使用內建測試帳號。</w:t>
+        <w:t>使用公司正式授權帳號登入；正式網址不提供測試快捷登入。</w:t>
       </w:r>
     </w:p>
     <w:p>
@@ -4269,7 +4269,7 @@
                 <w:b w:val="0"/>
                 <w:sz w:val="18"/>
               </w:rPr>
-              <w:t>可使用測試帳號或公司帳號登入。</w:t>
+              <w:t>可使用公司正式授權帳號登入。</w:t>
             </w:r>
           </w:p>
         </w:tc>

</xml_diff>